<commit_message>
Adaptación de trabajo de historia Sagrada 8 y 11 de junio 2026
</commit_message>
<xml_diff>
--- a/Melany - IAFO/Historia Sagrada y Tutoria/Historia Sagrada - Melany junio 2026.docx
+++ b/Melany - IAFO/Historia Sagrada y Tutoria/Historia Sagrada - Melany junio 2026.docx
@@ -177,21 +177,7 @@
         <w:rPr>
           <w:rFonts w:eastAsia="Times New Roman"/>
         </w:rPr>
-        <w:t xml:space="preserve">Explica la analogía del reloj de William </w:t>
-      </w:r>
-      <w:proofErr w:type="spellStart"/>
-      <w:r>
-        <w:rPr>
-          <w:rFonts w:eastAsia="Times New Roman"/>
-        </w:rPr>
-        <w:t>Paley</w:t>
-      </w:r>
-      <w:proofErr w:type="spellEnd"/>
-      <w:r>
-        <w:rPr>
-          <w:rFonts w:eastAsia="Times New Roman"/>
-        </w:rPr>
-        <w:t xml:space="preserve"> con tus propias palabras.</w:t>
+        <w:t>Explica la analogía del reloj de William Paley con tus propias palabras.</w:t>
       </w:r>
     </w:p>
     <w:p>
@@ -470,6 +456,7 @@
         <w:rPr>
           <w:rFonts w:eastAsia="Times New Roman"/>
         </w:rPr>
+        <w:lastRenderedPageBreak/>
         <w:t>Lee el recuadro final sobre la complejidad de los ojos, pulmones y cerebro. ¿Qué órgano te asombra más y por qué te hace pensar en un Creador detallista?</w:t>
       </w:r>
     </w:p>
@@ -1497,7 +1484,7 @@
       <w:lvlText w:val="%1"/>
       <w:lvlJc w:val="left"/>
       <w:pPr>
-        <w:ind w:left="720" w:hanging="360"/>
+        <w:ind w:left="643" w:hanging="360"/>
       </w:pPr>
       <w:rPr>
         <w:rFonts w:hint="default"/>
@@ -1509,7 +1496,7 @@
       <w:lvlText w:val="%2."/>
       <w:lvlJc w:val="left"/>
       <w:pPr>
-        <w:ind w:left="1440" w:hanging="360"/>
+        <w:ind w:left="1363" w:hanging="360"/>
       </w:pPr>
     </w:lvl>
     <w:lvl w:ilvl="2" w:tplc="080A001B" w:tentative="1">
@@ -1518,7 +1505,7 @@
       <w:lvlText w:val="%3."/>
       <w:lvlJc w:val="right"/>
       <w:pPr>
-        <w:ind w:left="2160" w:hanging="180"/>
+        <w:ind w:left="2083" w:hanging="180"/>
       </w:pPr>
     </w:lvl>
     <w:lvl w:ilvl="3" w:tplc="080A000F" w:tentative="1">
@@ -1527,7 +1514,7 @@
       <w:lvlText w:val="%4."/>
       <w:lvlJc w:val="left"/>
       <w:pPr>
-        <w:ind w:left="2880" w:hanging="360"/>
+        <w:ind w:left="2803" w:hanging="360"/>
       </w:pPr>
     </w:lvl>
     <w:lvl w:ilvl="4" w:tplc="080A0019" w:tentative="1">
@@ -1536,7 +1523,7 @@
       <w:lvlText w:val="%5."/>
       <w:lvlJc w:val="left"/>
       <w:pPr>
-        <w:ind w:left="3600" w:hanging="360"/>
+        <w:ind w:left="3523" w:hanging="360"/>
       </w:pPr>
     </w:lvl>
     <w:lvl w:ilvl="5" w:tplc="080A001B" w:tentative="1">
@@ -1545,7 +1532,7 @@
       <w:lvlText w:val="%6."/>
       <w:lvlJc w:val="right"/>
       <w:pPr>
-        <w:ind w:left="4320" w:hanging="180"/>
+        <w:ind w:left="4243" w:hanging="180"/>
       </w:pPr>
     </w:lvl>
     <w:lvl w:ilvl="6" w:tplc="080A000F" w:tentative="1">
@@ -1554,7 +1541,7 @@
       <w:lvlText w:val="%7."/>
       <w:lvlJc w:val="left"/>
       <w:pPr>
-        <w:ind w:left="5040" w:hanging="360"/>
+        <w:ind w:left="4963" w:hanging="360"/>
       </w:pPr>
     </w:lvl>
     <w:lvl w:ilvl="7" w:tplc="080A0019" w:tentative="1">
@@ -1563,7 +1550,7 @@
       <w:lvlText w:val="%8."/>
       <w:lvlJc w:val="left"/>
       <w:pPr>
-        <w:ind w:left="5760" w:hanging="360"/>
+        <w:ind w:left="5683" w:hanging="360"/>
       </w:pPr>
     </w:lvl>
     <w:lvl w:ilvl="8" w:tplc="080A001B" w:tentative="1">
@@ -1572,7 +1559,7 @@
       <w:lvlText w:val="%9."/>
       <w:lvlJc w:val="right"/>
       <w:pPr>
-        <w:ind w:left="6480" w:hanging="180"/>
+        <w:ind w:left="6403" w:hanging="180"/>
       </w:pPr>
     </w:lvl>
   </w:abstractNum>

</xml_diff>